<commit_message>
docs (docs/): agrega la captura del Collection Runner a la evidencia de Postman
</commit_message>
<xml_diff>
--- a/docs/Evidencia-Postman.docx
+++ b/docs/Evidencia-Postman.docx
@@ -538,7 +538,7 @@
           <w:r>
             <w:fldChar w:fldCharType="separate"/>
           </w:r>
-          <w:hyperlink w:anchor="_Toc242353463" w:history="1">
+          <w:hyperlink w:anchor="_Toc242355860" w:history="1">
             <w:r>
               <w:rPr>
                 <w:rStyle w:val="Hyperlink"/>
@@ -565,7 +565,7 @@
                 <w:noProof/>
                 <w:webHidden/>
               </w:rPr>
-              <w:instrText xml:space="preserve"> PAGEREF _Toc242353463 \h </w:instrText>
+              <w:instrText xml:space="preserve"> PAGEREF _Toc242355860 \h </w:instrText>
             </w:r>
             <w:r>
               <w:rPr>
@@ -610,7 +610,7 @@
               <w14:ligatures w14:val="standardContextual"/>
             </w:rPr>
           </w:pPr>
-          <w:hyperlink w:anchor="_Toc242353464" w:history="1">
+          <w:hyperlink w:anchor="_Toc242355861" w:history="1">
             <w:r>
               <w:rPr>
                 <w:rStyle w:val="Hyperlink"/>
@@ -637,7 +637,7 @@
                 <w:noProof/>
                 <w:webHidden/>
               </w:rPr>
-              <w:instrText xml:space="preserve"> PAGEREF _Toc242353464 \h </w:instrText>
+              <w:instrText xml:space="preserve"> PAGEREF _Toc242355861 \h </w:instrText>
             </w:r>
             <w:r>
               <w:rPr>
@@ -682,7 +682,7 @@
               <w14:ligatures w14:val="standardContextual"/>
             </w:rPr>
           </w:pPr>
-          <w:hyperlink w:anchor="_Toc242353465" w:history="1">
+          <w:hyperlink w:anchor="_Toc242355862" w:history="1">
             <w:r>
               <w:rPr>
                 <w:rStyle w:val="Hyperlink"/>
@@ -709,7 +709,7 @@
                 <w:noProof/>
                 <w:webHidden/>
               </w:rPr>
-              <w:instrText xml:space="preserve"> PAGEREF _Toc242353465 \h </w:instrText>
+              <w:instrText xml:space="preserve"> PAGEREF _Toc242355862 \h </w:instrText>
             </w:r>
             <w:r>
               <w:rPr>
@@ -754,7 +754,7 @@
               <w14:ligatures w14:val="standardContextual"/>
             </w:rPr>
           </w:pPr>
-          <w:hyperlink w:anchor="_Toc242353466" w:history="1">
+          <w:hyperlink w:anchor="_Toc242355863" w:history="1">
             <w:r>
               <w:rPr>
                 <w:rStyle w:val="Hyperlink"/>
@@ -781,7 +781,7 @@
                 <w:noProof/>
                 <w:webHidden/>
               </w:rPr>
-              <w:instrText xml:space="preserve"> PAGEREF _Toc242353466 \h </w:instrText>
+              <w:instrText xml:space="preserve"> PAGEREF _Toc242355863 \h </w:instrText>
             </w:r>
             <w:r>
               <w:rPr>
@@ -826,7 +826,7 @@
               <w14:ligatures w14:val="standardContextual"/>
             </w:rPr>
           </w:pPr>
-          <w:hyperlink w:anchor="_Toc242353467" w:history="1">
+          <w:hyperlink w:anchor="_Toc242355864" w:history="1">
             <w:r>
               <w:rPr>
                 <w:rStyle w:val="Hyperlink"/>
@@ -853,7 +853,7 @@
                 <w:noProof/>
                 <w:webHidden/>
               </w:rPr>
-              <w:instrText xml:space="preserve"> PAGEREF _Toc242353467 \h </w:instrText>
+              <w:instrText xml:space="preserve"> PAGEREF _Toc242355864 \h </w:instrText>
             </w:r>
             <w:r>
               <w:rPr>
@@ -898,7 +898,7 @@
               <w14:ligatures w14:val="standardContextual"/>
             </w:rPr>
           </w:pPr>
-          <w:hyperlink w:anchor="_Toc242353468" w:history="1">
+          <w:hyperlink w:anchor="_Toc242355865" w:history="1">
             <w:r>
               <w:rPr>
                 <w:rStyle w:val="Hyperlink"/>
@@ -925,7 +925,7 @@
                 <w:noProof/>
                 <w:webHidden/>
               </w:rPr>
-              <w:instrText xml:space="preserve"> PAGEREF _Toc242353468 \h </w:instrText>
+              <w:instrText xml:space="preserve"> PAGEREF _Toc242355865 \h </w:instrText>
             </w:r>
             <w:r>
               <w:rPr>
@@ -970,7 +970,7 @@
               <w14:ligatures w14:val="standardContextual"/>
             </w:rPr>
           </w:pPr>
-          <w:hyperlink w:anchor="_Toc242353469" w:history="1">
+          <w:hyperlink w:anchor="_Toc242355866" w:history="1">
             <w:r>
               <w:rPr>
                 <w:rStyle w:val="Hyperlink"/>
@@ -997,7 +997,7 @@
                 <w:noProof/>
                 <w:webHidden/>
               </w:rPr>
-              <w:instrText xml:space="preserve"> PAGEREF _Toc242353469 \h </w:instrText>
+              <w:instrText xml:space="preserve"> PAGEREF _Toc242355866 \h </w:instrText>
             </w:r>
             <w:r>
               <w:rPr>
@@ -1042,7 +1042,7 @@
               <w14:ligatures w14:val="standardContextual"/>
             </w:rPr>
           </w:pPr>
-          <w:hyperlink w:anchor="_Toc242353470" w:history="1">
+          <w:hyperlink w:anchor="_Toc242355867" w:history="1">
             <w:r>
               <w:rPr>
                 <w:rStyle w:val="Hyperlink"/>
@@ -1069,7 +1069,7 @@
                 <w:noProof/>
                 <w:webHidden/>
               </w:rPr>
-              <w:instrText xml:space="preserve"> PAGEREF _Toc242353470 \h </w:instrText>
+              <w:instrText xml:space="preserve"> PAGEREF _Toc242355867 \h </w:instrText>
             </w:r>
             <w:r>
               <w:rPr>
@@ -1114,7 +1114,7 @@
               <w14:ligatures w14:val="standardContextual"/>
             </w:rPr>
           </w:pPr>
-          <w:hyperlink w:anchor="_Toc242353471" w:history="1">
+          <w:hyperlink w:anchor="_Toc242355868" w:history="1">
             <w:r>
               <w:rPr>
                 <w:rStyle w:val="Hyperlink"/>
@@ -1141,7 +1141,7 @@
                 <w:noProof/>
                 <w:webHidden/>
               </w:rPr>
-              <w:instrText xml:space="preserve"> PAGEREF _Toc242353471 \h </w:instrText>
+              <w:instrText xml:space="preserve"> PAGEREF _Toc242355868 \h </w:instrText>
             </w:r>
             <w:r>
               <w:rPr>
@@ -1186,7 +1186,7 @@
               <w14:ligatures w14:val="standardContextual"/>
             </w:rPr>
           </w:pPr>
-          <w:hyperlink w:anchor="_Toc242353472" w:history="1">
+          <w:hyperlink w:anchor="_Toc242355869" w:history="1">
             <w:r>
               <w:rPr>
                 <w:rStyle w:val="Hyperlink"/>
@@ -1213,7 +1213,7 @@
                 <w:noProof/>
                 <w:webHidden/>
               </w:rPr>
-              <w:instrText xml:space="preserve"> PAGEREF _Toc242353472 \h </w:instrText>
+              <w:instrText xml:space="preserve"> PAGEREF _Toc242355869 \h </w:instrText>
             </w:r>
             <w:r>
               <w:rPr>
@@ -1258,7 +1258,7 @@
               <w14:ligatures w14:val="standardContextual"/>
             </w:rPr>
           </w:pPr>
-          <w:hyperlink w:anchor="_Toc242353473" w:history="1">
+          <w:hyperlink w:anchor="_Toc242355870" w:history="1">
             <w:r>
               <w:rPr>
                 <w:rStyle w:val="Hyperlink"/>
@@ -1285,7 +1285,7 @@
                 <w:noProof/>
                 <w:webHidden/>
               </w:rPr>
-              <w:instrText xml:space="preserve"> PAGEREF _Toc242353473 \h </w:instrText>
+              <w:instrText xml:space="preserve"> PAGEREF _Toc242355870 \h </w:instrText>
             </w:r>
             <w:r>
               <w:rPr>
@@ -1330,7 +1330,7 @@
               <w14:ligatures w14:val="standardContextual"/>
             </w:rPr>
           </w:pPr>
-          <w:hyperlink w:anchor="_Toc242353474" w:history="1">
+          <w:hyperlink w:anchor="_Toc242355871" w:history="1">
             <w:r>
               <w:rPr>
                 <w:rStyle w:val="Hyperlink"/>
@@ -1357,7 +1357,7 @@
                 <w:noProof/>
                 <w:webHidden/>
               </w:rPr>
-              <w:instrText xml:space="preserve"> PAGEREF _Toc242353474 \h </w:instrText>
+              <w:instrText xml:space="preserve"> PAGEREF _Toc242355871 \h </w:instrText>
             </w:r>
             <w:r>
               <w:rPr>
@@ -1402,7 +1402,7 @@
               <w14:ligatures w14:val="standardContextual"/>
             </w:rPr>
           </w:pPr>
-          <w:hyperlink w:anchor="_Toc242353475" w:history="1">
+          <w:hyperlink w:anchor="_Toc242355872" w:history="1">
             <w:r>
               <w:rPr>
                 <w:rStyle w:val="Hyperlink"/>
@@ -1429,7 +1429,7 @@
                 <w:noProof/>
                 <w:webHidden/>
               </w:rPr>
-              <w:instrText xml:space="preserve"> PAGEREF _Toc242353475 \h </w:instrText>
+              <w:instrText xml:space="preserve"> PAGEREF _Toc242355872 \h </w:instrText>
             </w:r>
             <w:r>
               <w:rPr>
@@ -1474,7 +1474,7 @@
               <w14:ligatures w14:val="standardContextual"/>
             </w:rPr>
           </w:pPr>
-          <w:hyperlink w:anchor="_Toc242353476" w:history="1">
+          <w:hyperlink w:anchor="_Toc242355873" w:history="1">
             <w:r>
               <w:rPr>
                 <w:rStyle w:val="Hyperlink"/>
@@ -1501,7 +1501,7 @@
                 <w:noProof/>
                 <w:webHidden/>
               </w:rPr>
-              <w:instrText xml:space="preserve"> PAGEREF _Toc242353476 \h </w:instrText>
+              <w:instrText xml:space="preserve"> PAGEREF _Toc242355873 \h </w:instrText>
             </w:r>
             <w:r>
               <w:rPr>
@@ -1546,7 +1546,7 @@
               <w14:ligatures w14:val="standardContextual"/>
             </w:rPr>
           </w:pPr>
-          <w:hyperlink w:anchor="_Toc242353477" w:history="1">
+          <w:hyperlink w:anchor="_Toc242355874" w:history="1">
             <w:r>
               <w:rPr>
                 <w:rStyle w:val="Hyperlink"/>
@@ -1573,7 +1573,7 @@
                 <w:noProof/>
                 <w:webHidden/>
               </w:rPr>
-              <w:instrText xml:space="preserve"> PAGEREF _Toc242353477 \h </w:instrText>
+              <w:instrText xml:space="preserve"> PAGEREF _Toc242355874 \h </w:instrText>
             </w:r>
             <w:r>
               <w:rPr>
@@ -1649,7 +1649,7 @@
         <w:pStyle w:val="Heading1"/>
         <w:pageBreakBefore/>
       </w:pPr>
-      <w:bookmarkStart w:id="0" w:name="_Toc242353463"/>
+      <w:bookmarkStart w:id="0" w:name="_Toc242355860"/>
       <w:r>
         <w:lastRenderedPageBreak/>
         <w:t>1. Qué se probó y cómo</w:t>
@@ -1665,7 +1665,7 @@
       <w:pPr>
         <w:pStyle w:val="Heading2"/>
       </w:pPr>
-      <w:bookmarkStart w:id="1" w:name="_Toc242353464"/>
+      <w:bookmarkStart w:id="1" w:name="_Toc242355861"/>
       <w:r>
         <w:t>1.1 Dos colecciones en la carpeta Datos</w:t>
       </w:r>
@@ -1712,7 +1712,7 @@
       <w:pPr>
         <w:pStyle w:val="Heading2"/>
       </w:pPr>
-      <w:bookmarkStart w:id="2" w:name="_Toc242353465"/>
+      <w:bookmarkStart w:id="2" w:name="_Toc242355862"/>
       <w:r>
         <w:t>1.2 Organización de la colección</w:t>
       </w:r>
@@ -1868,7 +1868,7 @@
       <w:pPr>
         <w:pStyle w:val="Heading2"/>
       </w:pPr>
-      <w:bookmarkStart w:id="3" w:name="_Toc242353466"/>
+      <w:bookmarkStart w:id="3" w:name="_Toc242355863"/>
       <w:r>
         <w:t>1.3 Cómo se ejecuta</w:t>
       </w:r>
@@ -1924,7 +1924,7 @@
       <w:pPr>
         <w:pStyle w:val="Heading1"/>
       </w:pPr>
-      <w:bookmarkStart w:id="4" w:name="_Toc242353467"/>
+      <w:bookmarkStart w:id="4" w:name="_Toc242355864"/>
       <w:r>
         <w:t>2. Resultado de la ejecución</w:t>
       </w:r>
@@ -3157,26 +3157,54 @@
     </w:p>
     <w:p>
       <w:r>
-        <w:t>Los 232 requests suman 510 assertions. Hay 261 ejecuciones porque algunos pasos de preparación se repiten para cada jugador (registro, login, declaración de skills e inscripción).</w:t>
+        <w:t>Los 232 requests suman 510 assertions. Hay 261 ejecuciones porque algunos pasos de preparación se repiten para cada jugador (registro, login, declaración de skills e inscripción). En el Collection Runner de Postman la colección completa dio 510 tests aprobados, 0 fallidos y 0 errores, en 21,9 segundos (Ilustración 1).</w:t>
       </w:r>
     </w:p>
     <w:p>
       <w:pPr>
-        <w:pBdr>
-          <w:top w:val="dashed" w:sz="6" w:space="4" w:color="808080"/>
-          <w:left w:val="dashed" w:sz="6" w:space="4" w:color="808080"/>
-          <w:bottom w:val="dashed" w:sz="6" w:space="4" w:color="808080"/>
-          <w:right w:val="dashed" w:sz="6" w:space="4" w:color="808080"/>
-        </w:pBdr>
+        <w:keepNext/>
         <w:spacing w:before="200" w:after="200"/>
         <w:jc w:val="center"/>
       </w:pPr>
       <w:r>
         <w:rPr>
-          <w:b/>
-          <w:color w:val="C00000"/>
+          <w:noProof/>
         </w:rPr>
-        <w:t>[COMPLETAR] Captura del resumen del Collection Runner de Postman: 232 requests, 510 tests aprobados, 0 fallidos.</w:t>
+        <w:drawing>
+          <wp:inline distT="0" distB="0" distL="0" distR="0" wp14:anchorId="44457A85" wp14:editId="387A09BF">
+            <wp:extent cx="5759450" cy="1046079"/>
+            <wp:effectExtent l="0" t="0" r="0" b="0"/>
+            <wp:docPr id="1659117782" name="Picture 1659117782"/>
+            <wp:cNvGraphicFramePr>
+              <a:graphicFrameLocks xmlns:a="http://schemas.openxmlformats.org/drawingml/2006/main" noChangeAspect="1"/>
+            </wp:cNvGraphicFramePr>
+            <a:graphic xmlns:a="http://schemas.openxmlformats.org/drawingml/2006/main">
+              <a:graphicData uri="http://schemas.openxmlformats.org/drawingml/2006/picture">
+                <pic:pic xmlns:pic="http://schemas.openxmlformats.org/drawingml/2006/picture">
+                  <pic:nvPicPr>
+                    <pic:cNvPr id="0" name="4.png"/>
+                    <pic:cNvPicPr/>
+                  </pic:nvPicPr>
+                  <pic:blipFill>
+                    <a:blip r:embed="rId9"/>
+                    <a:stretch>
+                      <a:fillRect/>
+                    </a:stretch>
+                  </pic:blipFill>
+                  <pic:spPr>
+                    <a:xfrm>
+                      <a:off x="0" y="0"/>
+                      <a:ext cx="5759450" cy="1046079"/>
+                    </a:xfrm>
+                    <a:prstGeom prst="rect">
+                      <a:avLst/>
+                    </a:prstGeom>
+                  </pic:spPr>
+                </pic:pic>
+              </a:graphicData>
+            </a:graphic>
+          </wp:inline>
+        </w:drawing>
       </w:r>
     </w:p>
     <w:p>
@@ -3220,7 +3248,7 @@
       <w:pPr>
         <w:pStyle w:val="Heading1"/>
       </w:pPr>
-      <w:bookmarkStart w:id="5" w:name="_Toc242353468"/>
+      <w:bookmarkStart w:id="5" w:name="_Toc242355865"/>
       <w:r>
         <w:t>3. Casos de las funcionalidades con asterisco</w:t>
       </w:r>
@@ -3246,6 +3274,7 @@
           <w:sz w:val="20"/>
           <w:szCs w:val="20"/>
         </w:rPr>
+        <w:lastRenderedPageBreak/>
         <w:t>Tabla 2. Categorías de la letra cubiertas por funcionalidad</w:t>
       </w:r>
     </w:p>
@@ -3690,7 +3719,6 @@
                 <w:sz w:val="17"/>
                 <w:szCs w:val="17"/>
               </w:rPr>
-              <w:lastRenderedPageBreak/>
               <w:t>Valores límite</w:t>
             </w:r>
           </w:p>
@@ -5526,7 +5554,7 @@
       <w:pPr>
         <w:pStyle w:val="Heading2"/>
       </w:pPr>
-      <w:bookmarkStart w:id="6" w:name="_Toc242353469"/>
+      <w:bookmarkStart w:id="6" w:name="_Toc242355866"/>
       <w:r>
         <w:t>3.1 Catálogo de skills (2.2)</w:t>
       </w:r>
@@ -5966,6 +5994,7 @@
                 <w:sz w:val="16"/>
                 <w:szCs w:val="16"/>
               </w:rPr>
+              <w:lastRenderedPageBreak/>
               <w:t>2</w:t>
             </w:r>
           </w:p>
@@ -6286,7 +6315,6 @@
                 <w:sz w:val="16"/>
                 <w:szCs w:val="16"/>
               </w:rPr>
-              <w:lastRenderedPageBreak/>
               <w:t>4</w:t>
             </w:r>
           </w:p>
@@ -12367,6 +12395,7 @@
                 <w:sz w:val="16"/>
                 <w:szCs w:val="16"/>
               </w:rPr>
+              <w:lastRenderedPageBreak/>
               <w:t>42</w:t>
             </w:r>
           </w:p>
@@ -12687,7 +12716,6 @@
                 <w:sz w:val="16"/>
                 <w:szCs w:val="16"/>
               </w:rPr>
-              <w:lastRenderedPageBreak/>
               <w:t>44</w:t>
             </w:r>
           </w:p>
@@ -14267,7 +14295,7 @@
       <w:pPr>
         <w:pStyle w:val="Heading2"/>
       </w:pPr>
-      <w:bookmarkStart w:id="7" w:name="_Toc242353470"/>
+      <w:bookmarkStart w:id="7" w:name="_Toc242355867"/>
       <w:r>
         <w:t>3.2 Inscripción a un torneo (1.5)</w:t>
       </w:r>
@@ -15694,6 +15722,7 @@
                 <w:sz w:val="16"/>
                 <w:szCs w:val="16"/>
               </w:rPr>
+              <w:lastRenderedPageBreak/>
               <w:t>8</w:t>
             </w:r>
           </w:p>
@@ -15854,7 +15883,6 @@
                 <w:sz w:val="16"/>
                 <w:szCs w:val="16"/>
               </w:rPr>
-              <w:lastRenderedPageBreak/>
               <w:t>9</w:t>
             </w:r>
           </w:p>
@@ -19194,7 +19222,7 @@
       <w:pPr>
         <w:pStyle w:val="Heading2"/>
       </w:pPr>
-      <w:bookmarkStart w:id="8" w:name="_Toc242353471"/>
+      <w:bookmarkStart w:id="8" w:name="_Toc242355868"/>
       <w:r>
         <w:t>3.3 Lanzar una skill (1.8)</w:t>
       </w:r>
@@ -19202,10 +19230,11 @@
     </w:p>
     <w:p>
       <w:r>
-        <w:t>La batalla de prueba se arma en la carpeta Rondas: un torneo de cupo 4 con dos skills obligatorias, cuatro jugadores con cinco skills declaradas y una skill que se desactiva después de declararla. Los casos siguen la batalla turno por turno, así que cada regla se prueba en el momento en que se puede violar: el turno del rival antes del primer lanzamiento, la skill repetida en el turno 3, las obligatorias pendientes cuando a un jugador le quedan tantas como turnos, y la batalla en arbitraje después del octav</w:t>
+        <w:t xml:space="preserve">La batalla de prueba se arma en la carpeta Rondas: un torneo de cupo 4 con dos skills obligatorias, cuatro jugadores con cinco skills declaradas y una skill que se desactiva después de declararla. Los casos siguen la batalla turno por turno, así que cada regla se prueba en el momento en que se puede violar: el turno del rival antes del primer lanzamiento, la skill repetida en el turno 3, las obligatorias pendientes cuando a un jugador le quedan tantas como turnos, y la batalla en arbitraje después del octavo lanzamiento. Los casos de body se ejecutan antes del </w:t>
       </w:r>
       <w:r>
-        <w:t>o lanzamiento. Los casos de body se ejecutan antes del primer turno, para que el rechazo no dependa del estado.</w:t>
+        <w:lastRenderedPageBreak/>
+        <w:t>primer turno, para que el rechazo no dependa del estado.</w:t>
       </w:r>
     </w:p>
     <w:p>
@@ -19223,7 +19252,6 @@
           <w:sz w:val="20"/>
           <w:szCs w:val="20"/>
         </w:rPr>
-        <w:lastRenderedPageBreak/>
         <w:t>Tabla 5. Casos de lanzar una skill</w:t>
       </w:r>
     </w:p>
@@ -23455,6 +23483,7 @@
                 <w:sz w:val="16"/>
                 <w:szCs w:val="16"/>
               </w:rPr>
+              <w:lastRenderedPageBreak/>
               <w:t>26</w:t>
             </w:r>
           </w:p>
@@ -23775,7 +23804,6 @@
                 <w:sz w:val="16"/>
                 <w:szCs w:val="16"/>
               </w:rPr>
-              <w:lastRenderedPageBreak/>
               <w:t>28</w:t>
             </w:r>
           </w:p>
@@ -23915,7 +23943,7 @@
       <w:pPr>
         <w:pStyle w:val="Heading2"/>
       </w:pPr>
-      <w:bookmarkStart w:id="9" w:name="_Toc242353472"/>
+      <w:bookmarkStart w:id="9" w:name="_Toc242355869"/>
       <w:r>
         <w:t>3.4 Fallar una batalla (1.9)</w:t>
       </w:r>
@@ -23923,10 +23951,7 @@
     </w:p>
     <w:p>
       <w:r>
-        <w:t>Se fallan las tres situaciones de la letra: una batalla en arbitraje (después de los ocho lanzamientos), una pendiente, que resuelve un abandono, y la final del torneo. El comentario se prueba en sus cuatro bordes (9, 10, 500 y 501 caracteres) y también vacío y en blanco. El fallo exitoso verifica los efectos que pide la letra: la batalla queda Finalizada con su ganador, el ELO de los dos cambia según los valores previos de ambos, y la inscripción del perdedor pasa a Eliminada. Solo puede fallarla el organi</w:t>
-      </w:r>
-      <w:r>
-        <w:t>zador asignado al torneo, así que se prueban también un jugador, un administrador y otro organizador.</w:t>
+        <w:t>Se fallan las tres situaciones de la letra: una batalla en arbitraje (después de los ocho lanzamientos), una pendiente, que resuelve un abandono, y la final del torneo. El comentario se prueba en sus cuatro bordes (9, 10, 500 y 501 caracteres) y también vacío y en blanco. El fallo exitoso verifica los efectos que pide la letra: la batalla queda Finalizada con su ganador, el ELO de los dos cambia según los valores previos de ambos, y la inscripción del perdedor pasa a Eliminada. Solo puede fallarla el organizador asignado al torneo, así que se prueban también un jugador, un administrador y otro organizador.</w:t>
       </w:r>
     </w:p>
     <w:p>
@@ -27695,6 +27720,7 @@
                 <w:sz w:val="16"/>
                 <w:szCs w:val="16"/>
               </w:rPr>
+              <w:lastRenderedPageBreak/>
               <w:t>23</w:t>
             </w:r>
           </w:p>
@@ -28015,7 +28041,6 @@
                 <w:sz w:val="16"/>
                 <w:szCs w:val="16"/>
               </w:rPr>
-              <w:lastRenderedPageBreak/>
               <w:t>25</w:t>
             </w:r>
           </w:p>
@@ -28635,7 +28660,7 @@
       <w:pPr>
         <w:pStyle w:val="Heading2"/>
       </w:pPr>
-      <w:bookmarkStart w:id="10" w:name="_Toc242353473"/>
+      <w:bookmarkStart w:id="10" w:name="_Toc242355870"/>
       <w:r>
         <w:t>3.5 Generar rondas y finalizar el torneo (2.5)</w:t>
       </w:r>
@@ -31141,6 +31166,7 @@
                 <w:sz w:val="16"/>
                 <w:szCs w:val="16"/>
               </w:rPr>
+              <w:lastRenderedPageBreak/>
               <w:t>15</w:t>
             </w:r>
           </w:p>
@@ -31301,7 +31327,6 @@
                 <w:sz w:val="16"/>
                 <w:szCs w:val="16"/>
               </w:rPr>
-              <w:lastRenderedPageBreak/>
               <w:t>16</w:t>
             </w:r>
           </w:p>
@@ -32881,7 +32906,7 @@
       <w:pPr>
         <w:pStyle w:val="Heading1"/>
       </w:pPr>
-      <w:bookmarkStart w:id="11" w:name="_Toc242353474"/>
+      <w:bookmarkStart w:id="11" w:name="_Toc242355871"/>
       <w:r>
         <w:t>4. Caso feliz del resto de los endpoints</w:t>
       </w:r>
@@ -34578,6 +34603,7 @@
                 <w:sz w:val="16"/>
                 <w:szCs w:val="16"/>
               </w:rPr>
+              <w:lastRenderedPageBreak/>
               <w:t>10</w:t>
             </w:r>
           </w:p>
@@ -34898,7 +34924,6 @@
                 <w:sz w:val="16"/>
                 <w:szCs w:val="16"/>
               </w:rPr>
-              <w:lastRenderedPageBreak/>
               <w:t>12</w:t>
             </w:r>
           </w:p>
@@ -38238,7 +38263,7 @@
       <w:pPr>
         <w:pStyle w:val="Heading1"/>
       </w:pPr>
-      <w:bookmarkStart w:id="12" w:name="_Toc242353475"/>
+      <w:bookmarkStart w:id="12" w:name="_Toc242355872"/>
       <w:r>
         <w:t>5. Hallazgos durante las pruebas</w:t>
       </w:r>
@@ -38267,6 +38292,7 @@
           <w:b/>
           <w:bCs/>
         </w:rPr>
+        <w:lastRenderedPageBreak/>
         <w:t>Dos criterios para el id 0.</w:t>
       </w:r>
       <w:r>
@@ -38279,18 +38305,14 @@
         <w:t>torneoId</w:t>
       </w:r>
       <w:r>
-        <w:t xml:space="preserve"> 0 responde 404 en la inscripción y 400 en </w:t>
-      </w:r>
-      <w:r>
-        <w:lastRenderedPageBreak/>
-        <w:t>lanzamientos y fallos, donde el DTO exige un id positivo. No es un error: la especificación define los dos comportamientos (R09 y reglas generales). Se agregaron los casos 0 y -1 para que el comportamiento quede probado.</w:t>
+        <w:t xml:space="preserve"> 0 responde 404 en la inscripción y 400 en lanzamientos y fallos, donde el DTO exige un id positivo. No es un error: la especificación define los dos comportamientos (R09 y reglas generales). Se agregaron los casos 0 y -1 para que el comportamiento quede probado.</w:t>
       </w:r>
     </w:p>
     <w:p>
       <w:pPr>
         <w:pStyle w:val="Heading1"/>
       </w:pPr>
-      <w:bookmarkStart w:id="13" w:name="_Toc242353476"/>
+      <w:bookmarkStart w:id="13" w:name="_Toc242355873"/>
       <w:r>
         <w:t>6. Uso de IA</w:t>
       </w:r>
@@ -38298,10 +38320,7 @@
     </w:p>
     <w:p>
       <w:r>
-        <w:t>Este documento lo redactó Claude Code (modelo Claude Opus 5.5) a partir de la colección, la letra, la especificación de la API y la bitácora. También generó las tablas de casos leyendo la colección, para que coincidan con lo que se ejecuta. Claude Code revisó la colección contra las categorías de la letra, propuso los casos faltantes (body nulo y mal formado en la inscripción, campos redundantes, el 415, el torneo en curso) y armó la colección de evidencia. El integrante definió el alcance: una colección ap</w:t>
-      </w:r>
-      <w:r>
-        <w:t>arte para la evidencia, dejar el 404 para el id 0, y qué funcionalidades llevan solo el caso feliz. El integrante también encontró, al correr la colección, el fallo de la prueba del ranking.</w:t>
+        <w:t>Este documento lo redactó Claude Code (modelo Claude Opus 5.5) a partir de la colección, la letra, la especificación de la API y la bitácora. También generó las tablas de casos leyendo la colección, para que coincidan con lo que se ejecuta. Claude Code revisó la colección contra las categorías de la letra, propuso los casos faltantes (body nulo y mal formado en la inscripción, campos redundantes, el 415, el torneo en curso) y armó la colección de evidencia. El integrante definió el alcance: una colección aparte para la evidencia, dejar el 404 para el id 0, y qué funcionalidades llevan solo el caso feliz. El integrante también encontró, al correr la colección, el fallo de la prueba del ranking.</w:t>
       </w:r>
     </w:p>
     <w:p>
@@ -38327,7 +38346,7 @@
       <w:pPr>
         <w:pStyle w:val="Heading1"/>
       </w:pPr>
-      <w:bookmarkStart w:id="14" w:name="_Toc242353477"/>
+      <w:bookmarkStart w:id="14" w:name="_Toc242355874"/>
       <w:r>
         <w:t>7. Referencias bibliográficas</w:t>
       </w:r>
@@ -38349,8 +38368,8 @@
       </w:r>
     </w:p>
     <w:sectPr>
-      <w:footerReference w:type="default" r:id="rId9"/>
-      <w:footerReference w:type="first" r:id="rId10"/>
+      <w:footerReference w:type="default" r:id="rId10"/>
+      <w:footerReference w:type="first" r:id="rId11"/>
       <w:pgSz w:w="11920" w:h="16840"/>
       <w:pgMar w:top="1425" w:right="1425" w:bottom="1425" w:left="1425" w:header="720" w:footer="720" w:gutter="0"/>
       <w:pgNumType w:start="1"/>

</xml_diff>

<commit_message>
docs (docs/): agrega la reflexión del equipo a la evidencia de Postman
</commit_message>
<xml_diff>
--- a/docs/Evidencia-Postman.docx
+++ b/docs/Evidencia-Postman.docx
@@ -538,7 +538,7 @@
           <w:r>
             <w:fldChar w:fldCharType="separate"/>
           </w:r>
-          <w:hyperlink w:anchor="_Toc242355860" w:history="1">
+          <w:hyperlink w:anchor="_Toc242355996" w:history="1">
             <w:r>
               <w:rPr>
                 <w:rStyle w:val="Hyperlink"/>
@@ -565,7 +565,7 @@
                 <w:noProof/>
                 <w:webHidden/>
               </w:rPr>
-              <w:instrText xml:space="preserve"> PAGEREF _Toc242355860 \h </w:instrText>
+              <w:instrText xml:space="preserve"> PAGEREF _Toc242355996 \h </w:instrText>
             </w:r>
             <w:r>
               <w:rPr>
@@ -610,7 +610,7 @@
               <w14:ligatures w14:val="standardContextual"/>
             </w:rPr>
           </w:pPr>
-          <w:hyperlink w:anchor="_Toc242355861" w:history="1">
+          <w:hyperlink w:anchor="_Toc242355997" w:history="1">
             <w:r>
               <w:rPr>
                 <w:rStyle w:val="Hyperlink"/>
@@ -637,7 +637,7 @@
                 <w:noProof/>
                 <w:webHidden/>
               </w:rPr>
-              <w:instrText xml:space="preserve"> PAGEREF _Toc242355861 \h </w:instrText>
+              <w:instrText xml:space="preserve"> PAGEREF _Toc242355997 \h </w:instrText>
             </w:r>
             <w:r>
               <w:rPr>
@@ -682,7 +682,7 @@
               <w14:ligatures w14:val="standardContextual"/>
             </w:rPr>
           </w:pPr>
-          <w:hyperlink w:anchor="_Toc242355862" w:history="1">
+          <w:hyperlink w:anchor="_Toc242355998" w:history="1">
             <w:r>
               <w:rPr>
                 <w:rStyle w:val="Hyperlink"/>
@@ -709,7 +709,7 @@
                 <w:noProof/>
                 <w:webHidden/>
               </w:rPr>
-              <w:instrText xml:space="preserve"> PAGEREF _Toc242355862 \h </w:instrText>
+              <w:instrText xml:space="preserve"> PAGEREF _Toc242355998 \h </w:instrText>
             </w:r>
             <w:r>
               <w:rPr>
@@ -754,7 +754,7 @@
               <w14:ligatures w14:val="standardContextual"/>
             </w:rPr>
           </w:pPr>
-          <w:hyperlink w:anchor="_Toc242355863" w:history="1">
+          <w:hyperlink w:anchor="_Toc242355999" w:history="1">
             <w:r>
               <w:rPr>
                 <w:rStyle w:val="Hyperlink"/>
@@ -781,7 +781,7 @@
                 <w:noProof/>
                 <w:webHidden/>
               </w:rPr>
-              <w:instrText xml:space="preserve"> PAGEREF _Toc242355863 \h </w:instrText>
+              <w:instrText xml:space="preserve"> PAGEREF _Toc242355999 \h </w:instrText>
             </w:r>
             <w:r>
               <w:rPr>
@@ -826,7 +826,7 @@
               <w14:ligatures w14:val="standardContextual"/>
             </w:rPr>
           </w:pPr>
-          <w:hyperlink w:anchor="_Toc242355864" w:history="1">
+          <w:hyperlink w:anchor="_Toc242356000" w:history="1">
             <w:r>
               <w:rPr>
                 <w:rStyle w:val="Hyperlink"/>
@@ -853,7 +853,7 @@
                 <w:noProof/>
                 <w:webHidden/>
               </w:rPr>
-              <w:instrText xml:space="preserve"> PAGEREF _Toc242355864 \h </w:instrText>
+              <w:instrText xml:space="preserve"> PAGEREF _Toc242356000 \h </w:instrText>
             </w:r>
             <w:r>
               <w:rPr>
@@ -898,7 +898,7 @@
               <w14:ligatures w14:val="standardContextual"/>
             </w:rPr>
           </w:pPr>
-          <w:hyperlink w:anchor="_Toc242355865" w:history="1">
+          <w:hyperlink w:anchor="_Toc242356001" w:history="1">
             <w:r>
               <w:rPr>
                 <w:rStyle w:val="Hyperlink"/>
@@ -925,7 +925,7 @@
                 <w:noProof/>
                 <w:webHidden/>
               </w:rPr>
-              <w:instrText xml:space="preserve"> PAGEREF _Toc242355865 \h </w:instrText>
+              <w:instrText xml:space="preserve"> PAGEREF _Toc242356001 \h </w:instrText>
             </w:r>
             <w:r>
               <w:rPr>
@@ -970,7 +970,7 @@
               <w14:ligatures w14:val="standardContextual"/>
             </w:rPr>
           </w:pPr>
-          <w:hyperlink w:anchor="_Toc242355866" w:history="1">
+          <w:hyperlink w:anchor="_Toc242356002" w:history="1">
             <w:r>
               <w:rPr>
                 <w:rStyle w:val="Hyperlink"/>
@@ -997,7 +997,7 @@
                 <w:noProof/>
                 <w:webHidden/>
               </w:rPr>
-              <w:instrText xml:space="preserve"> PAGEREF _Toc242355866 \h </w:instrText>
+              <w:instrText xml:space="preserve"> PAGEREF _Toc242356002 \h </w:instrText>
             </w:r>
             <w:r>
               <w:rPr>
@@ -1042,7 +1042,7 @@
               <w14:ligatures w14:val="standardContextual"/>
             </w:rPr>
           </w:pPr>
-          <w:hyperlink w:anchor="_Toc242355867" w:history="1">
+          <w:hyperlink w:anchor="_Toc242356003" w:history="1">
             <w:r>
               <w:rPr>
                 <w:rStyle w:val="Hyperlink"/>
@@ -1069,7 +1069,7 @@
                 <w:noProof/>
                 <w:webHidden/>
               </w:rPr>
-              <w:instrText xml:space="preserve"> PAGEREF _Toc242355867 \h </w:instrText>
+              <w:instrText xml:space="preserve"> PAGEREF _Toc242356003 \h </w:instrText>
             </w:r>
             <w:r>
               <w:rPr>
@@ -1114,7 +1114,7 @@
               <w14:ligatures w14:val="standardContextual"/>
             </w:rPr>
           </w:pPr>
-          <w:hyperlink w:anchor="_Toc242355868" w:history="1">
+          <w:hyperlink w:anchor="_Toc242356004" w:history="1">
             <w:r>
               <w:rPr>
                 <w:rStyle w:val="Hyperlink"/>
@@ -1141,7 +1141,7 @@
                 <w:noProof/>
                 <w:webHidden/>
               </w:rPr>
-              <w:instrText xml:space="preserve"> PAGEREF _Toc242355868 \h </w:instrText>
+              <w:instrText xml:space="preserve"> PAGEREF _Toc242356004 \h </w:instrText>
             </w:r>
             <w:r>
               <w:rPr>
@@ -1186,7 +1186,7 @@
               <w14:ligatures w14:val="standardContextual"/>
             </w:rPr>
           </w:pPr>
-          <w:hyperlink w:anchor="_Toc242355869" w:history="1">
+          <w:hyperlink w:anchor="_Toc242356005" w:history="1">
             <w:r>
               <w:rPr>
                 <w:rStyle w:val="Hyperlink"/>
@@ -1213,7 +1213,7 @@
                 <w:noProof/>
                 <w:webHidden/>
               </w:rPr>
-              <w:instrText xml:space="preserve"> PAGEREF _Toc242355869 \h </w:instrText>
+              <w:instrText xml:space="preserve"> PAGEREF _Toc242356005 \h </w:instrText>
             </w:r>
             <w:r>
               <w:rPr>
@@ -1258,7 +1258,7 @@
               <w14:ligatures w14:val="standardContextual"/>
             </w:rPr>
           </w:pPr>
-          <w:hyperlink w:anchor="_Toc242355870" w:history="1">
+          <w:hyperlink w:anchor="_Toc242356006" w:history="1">
             <w:r>
               <w:rPr>
                 <w:rStyle w:val="Hyperlink"/>
@@ -1285,7 +1285,7 @@
                 <w:noProof/>
                 <w:webHidden/>
               </w:rPr>
-              <w:instrText xml:space="preserve"> PAGEREF _Toc242355870 \h </w:instrText>
+              <w:instrText xml:space="preserve"> PAGEREF _Toc242356006 \h </w:instrText>
             </w:r>
             <w:r>
               <w:rPr>
@@ -1330,7 +1330,7 @@
               <w14:ligatures w14:val="standardContextual"/>
             </w:rPr>
           </w:pPr>
-          <w:hyperlink w:anchor="_Toc242355871" w:history="1">
+          <w:hyperlink w:anchor="_Toc242356007" w:history="1">
             <w:r>
               <w:rPr>
                 <w:rStyle w:val="Hyperlink"/>
@@ -1357,7 +1357,7 @@
                 <w:noProof/>
                 <w:webHidden/>
               </w:rPr>
-              <w:instrText xml:space="preserve"> PAGEREF _Toc242355871 \h </w:instrText>
+              <w:instrText xml:space="preserve"> PAGEREF _Toc242356007 \h </w:instrText>
             </w:r>
             <w:r>
               <w:rPr>
@@ -1402,7 +1402,7 @@
               <w14:ligatures w14:val="standardContextual"/>
             </w:rPr>
           </w:pPr>
-          <w:hyperlink w:anchor="_Toc242355872" w:history="1">
+          <w:hyperlink w:anchor="_Toc242356008" w:history="1">
             <w:r>
               <w:rPr>
                 <w:rStyle w:val="Hyperlink"/>
@@ -1429,7 +1429,7 @@
                 <w:noProof/>
                 <w:webHidden/>
               </w:rPr>
-              <w:instrText xml:space="preserve"> PAGEREF _Toc242355872 \h </w:instrText>
+              <w:instrText xml:space="preserve"> PAGEREF _Toc242356008 \h </w:instrText>
             </w:r>
             <w:r>
               <w:rPr>
@@ -1474,7 +1474,7 @@
               <w14:ligatures w14:val="standardContextual"/>
             </w:rPr>
           </w:pPr>
-          <w:hyperlink w:anchor="_Toc242355873" w:history="1">
+          <w:hyperlink w:anchor="_Toc242356009" w:history="1">
             <w:r>
               <w:rPr>
                 <w:rStyle w:val="Hyperlink"/>
@@ -1501,7 +1501,7 @@
                 <w:noProof/>
                 <w:webHidden/>
               </w:rPr>
-              <w:instrText xml:space="preserve"> PAGEREF _Toc242355873 \h </w:instrText>
+              <w:instrText xml:space="preserve"> PAGEREF _Toc242356009 \h </w:instrText>
             </w:r>
             <w:r>
               <w:rPr>
@@ -1546,7 +1546,7 @@
               <w14:ligatures w14:val="standardContextual"/>
             </w:rPr>
           </w:pPr>
-          <w:hyperlink w:anchor="_Toc242355874" w:history="1">
+          <w:hyperlink w:anchor="_Toc242356010" w:history="1">
             <w:r>
               <w:rPr>
                 <w:rStyle w:val="Hyperlink"/>
@@ -1573,7 +1573,7 @@
                 <w:noProof/>
                 <w:webHidden/>
               </w:rPr>
-              <w:instrText xml:space="preserve"> PAGEREF _Toc242355874 \h </w:instrText>
+              <w:instrText xml:space="preserve"> PAGEREF _Toc242356010 \h </w:instrText>
             </w:r>
             <w:r>
               <w:rPr>
@@ -1593,7 +1593,7 @@
                 <w:noProof/>
                 <w:webHidden/>
               </w:rPr>
-              <w:t>16</w:t>
+              <w:t>17</w:t>
             </w:r>
             <w:r>
               <w:rPr>
@@ -1649,7 +1649,7 @@
         <w:pStyle w:val="Heading1"/>
         <w:pageBreakBefore/>
       </w:pPr>
-      <w:bookmarkStart w:id="0" w:name="_Toc242355860"/>
+      <w:bookmarkStart w:id="0" w:name="_Toc242355996"/>
       <w:r>
         <w:lastRenderedPageBreak/>
         <w:t>1. Qué se probó y cómo</w:t>
@@ -1665,7 +1665,7 @@
       <w:pPr>
         <w:pStyle w:val="Heading2"/>
       </w:pPr>
-      <w:bookmarkStart w:id="1" w:name="_Toc242355861"/>
+      <w:bookmarkStart w:id="1" w:name="_Toc242355997"/>
       <w:r>
         <w:t>1.1 Dos colecciones en la carpeta Datos</w:t>
       </w:r>
@@ -1712,7 +1712,7 @@
       <w:pPr>
         <w:pStyle w:val="Heading2"/>
       </w:pPr>
-      <w:bookmarkStart w:id="2" w:name="_Toc242355862"/>
+      <w:bookmarkStart w:id="2" w:name="_Toc242355998"/>
       <w:r>
         <w:t>1.2 Organización de la colección</w:t>
       </w:r>
@@ -1868,7 +1868,7 @@
       <w:pPr>
         <w:pStyle w:val="Heading2"/>
       </w:pPr>
-      <w:bookmarkStart w:id="3" w:name="_Toc242355863"/>
+      <w:bookmarkStart w:id="3" w:name="_Toc242355999"/>
       <w:r>
         <w:t>1.3 Cómo se ejecuta</w:t>
       </w:r>
@@ -1924,7 +1924,7 @@
       <w:pPr>
         <w:pStyle w:val="Heading1"/>
       </w:pPr>
-      <w:bookmarkStart w:id="4" w:name="_Toc242355864"/>
+      <w:bookmarkStart w:id="4" w:name="_Toc242356000"/>
       <w:r>
         <w:t>2. Resultado de la ejecución</w:t>
       </w:r>
@@ -3248,7 +3248,7 @@
       <w:pPr>
         <w:pStyle w:val="Heading1"/>
       </w:pPr>
-      <w:bookmarkStart w:id="5" w:name="_Toc242355865"/>
+      <w:bookmarkStart w:id="5" w:name="_Toc242356001"/>
       <w:r>
         <w:t>3. Casos de las funcionalidades con asterisco</w:t>
       </w:r>
@@ -5554,7 +5554,7 @@
       <w:pPr>
         <w:pStyle w:val="Heading2"/>
       </w:pPr>
-      <w:bookmarkStart w:id="6" w:name="_Toc242355866"/>
+      <w:bookmarkStart w:id="6" w:name="_Toc242356002"/>
       <w:r>
         <w:t>3.1 Catálogo de skills (2.2)</w:t>
       </w:r>
@@ -14295,7 +14295,7 @@
       <w:pPr>
         <w:pStyle w:val="Heading2"/>
       </w:pPr>
-      <w:bookmarkStart w:id="7" w:name="_Toc242355867"/>
+      <w:bookmarkStart w:id="7" w:name="_Toc242356003"/>
       <w:r>
         <w:t>3.2 Inscripción a un torneo (1.5)</w:t>
       </w:r>
@@ -19222,7 +19222,7 @@
       <w:pPr>
         <w:pStyle w:val="Heading2"/>
       </w:pPr>
-      <w:bookmarkStart w:id="8" w:name="_Toc242355868"/>
+      <w:bookmarkStart w:id="8" w:name="_Toc242356004"/>
       <w:r>
         <w:t>3.3 Lanzar una skill (1.8)</w:t>
       </w:r>
@@ -23943,7 +23943,7 @@
       <w:pPr>
         <w:pStyle w:val="Heading2"/>
       </w:pPr>
-      <w:bookmarkStart w:id="9" w:name="_Toc242355869"/>
+      <w:bookmarkStart w:id="9" w:name="_Toc242356005"/>
       <w:r>
         <w:t>3.4 Fallar una batalla (1.9)</w:t>
       </w:r>
@@ -28660,7 +28660,7 @@
       <w:pPr>
         <w:pStyle w:val="Heading2"/>
       </w:pPr>
-      <w:bookmarkStart w:id="10" w:name="_Toc242355870"/>
+      <w:bookmarkStart w:id="10" w:name="_Toc242356006"/>
       <w:r>
         <w:t>3.5 Generar rondas y finalizar el torneo (2.5)</w:t>
       </w:r>
@@ -32906,7 +32906,7 @@
       <w:pPr>
         <w:pStyle w:val="Heading1"/>
       </w:pPr>
-      <w:bookmarkStart w:id="11" w:name="_Toc242355871"/>
+      <w:bookmarkStart w:id="11" w:name="_Toc242356007"/>
       <w:r>
         <w:t>4. Caso feliz del resto de los endpoints</w:t>
       </w:r>
@@ -38263,7 +38263,7 @@
       <w:pPr>
         <w:pStyle w:val="Heading1"/>
       </w:pPr>
-      <w:bookmarkStart w:id="12" w:name="_Toc242355872"/>
+      <w:bookmarkStart w:id="12" w:name="_Toc242356008"/>
       <w:r>
         <w:t>5. Hallazgos durante las pruebas</w:t>
       </w:r>
@@ -38312,7 +38312,7 @@
       <w:pPr>
         <w:pStyle w:val="Heading1"/>
       </w:pPr>
-      <w:bookmarkStart w:id="13" w:name="_Toc242355873"/>
+      <w:bookmarkStart w:id="13" w:name="_Toc242356009"/>
       <w:r>
         <w:t>6. Uso de IA</w:t>
       </w:r>
@@ -38324,29 +38324,30 @@
       </w:r>
     </w:p>
     <w:p>
-      <w:pPr>
-        <w:pBdr>
-          <w:top w:val="dashed" w:sz="6" w:space="4" w:color="808080"/>
-          <w:left w:val="dashed" w:sz="6" w:space="4" w:color="808080"/>
-          <w:bottom w:val="dashed" w:sz="6" w:space="4" w:color="808080"/>
-          <w:right w:val="dashed" w:sz="6" w:space="4" w:color="808080"/>
-        </w:pBdr>
-        <w:spacing w:before="200" w:after="200"/>
-        <w:jc w:val="center"/>
-      </w:pPr>
       <w:r>
         <w:rPr>
           <w:b/>
-          <w:color w:val="C00000"/>
         </w:rPr>
-        <w:t>[COMPLETAR] Reflexión del equipo sobre las pruebas de la API y el uso de IA.</w:t>
+        <w:t>Reflexión del equipo.</w:t>
+      </w:r>
+      <w:r>
+        <w:t xml:space="preserve"> La IA nos sirvió sobre todo para revisar la colección contra la letra y para que el documento coincida con lo que se ejecuta. Cruzar 400 requests con la lista de categorías de la letra a mano es lento y es fácil saltearse algo; así aparecieron los casos que faltaban en la inscripción, los campos redundantes y el 415. Las tablas de este documento se generaron leyendo la colección, y por eso no hay casos escritos que no existan en Postman. También aprendimos a no aceptar sus conclusiones sin contrastarlas: la IA presentó el 404 del torneo 0 como una inconsistencia, y al revisar la especificación vimos que era el comportamiento definido. La primera clasificación automática de los requests dejaba bloques a medio armar, y el runner que escribió para verificar las colecciones dio un fallo falso hasta que se corrigió. La prueba del ranking que fallaba la encontramos nosotros al correr la colección, y una corrida interrumpida en Postman nos recordó que los números se toman de una ejecución completa.</w:t>
+      </w:r>
+    </w:p>
+    <w:p>
+      <w:r>
+        <w:t xml:space="preserve">Sobre las pruebas de la API, lo que más aprendimos es que la independencia de los tests (la I de FIRST) también vale en Postman. Una prueba que compara contra datos que dejaron corridas anteriores puede pasar en una base limpia y fallar en la nuestra sin que la API haya cambiado. Por eso cada corrida genera sus propios emails, códigos y tokens, y los casos verifican el errorCode y no solo el status: dos 409 con causas distintas tienen que distinguirse. Probar justo </w:t>
+      </w:r>
+      <w:r>
+        <w:lastRenderedPageBreak/>
+        <w:t>en el límite y uno afuera nos dio más confianza que muchos casos en el medio del rango. Todo lo que generó la IA lo revisamos y lo ejecutamos, y podemos explicar por qué está cada caso.</w:t>
       </w:r>
     </w:p>
     <w:p>
       <w:pPr>
         <w:pStyle w:val="Heading1"/>
       </w:pPr>
-      <w:bookmarkStart w:id="14" w:name="_Toc242355874"/>
+      <w:bookmarkStart w:id="14" w:name="_Toc242356010"/>
       <w:r>
         <w:t>7. Referencias bibliográficas</w:t>
       </w:r>

</xml_diff>

<commit_message>
docs (docs/): agrega el link al video y resume el uso de IA en la evidencia de Postman
</commit_message>
<xml_diff>
--- a/docs/Evidencia-Postman.docx
+++ b/docs/Evidencia-Postman.docx
@@ -538,7 +538,7 @@
           <w:r>
             <w:fldChar w:fldCharType="separate"/>
           </w:r>
-          <w:hyperlink w:anchor="_Toc242355996" w:history="1">
+          <w:hyperlink w:anchor="_Toc242366314" w:history="1">
             <w:r>
               <w:rPr>
                 <w:rStyle w:val="Hyperlink"/>
@@ -565,7 +565,7 @@
                 <w:noProof/>
                 <w:webHidden/>
               </w:rPr>
-              <w:instrText xml:space="preserve"> PAGEREF _Toc242355996 \h </w:instrText>
+              <w:instrText xml:space="preserve"> PAGEREF _Toc242366314 \h </w:instrText>
             </w:r>
             <w:r>
               <w:rPr>
@@ -610,7 +610,7 @@
               <w14:ligatures w14:val="standardContextual"/>
             </w:rPr>
           </w:pPr>
-          <w:hyperlink w:anchor="_Toc242355997" w:history="1">
+          <w:hyperlink w:anchor="_Toc242366315" w:history="1">
             <w:r>
               <w:rPr>
                 <w:rStyle w:val="Hyperlink"/>
@@ -637,7 +637,7 @@
                 <w:noProof/>
                 <w:webHidden/>
               </w:rPr>
-              <w:instrText xml:space="preserve"> PAGEREF _Toc242355997 \h </w:instrText>
+              <w:instrText xml:space="preserve"> PAGEREF _Toc242366315 \h </w:instrText>
             </w:r>
             <w:r>
               <w:rPr>
@@ -682,7 +682,7 @@
               <w14:ligatures w14:val="standardContextual"/>
             </w:rPr>
           </w:pPr>
-          <w:hyperlink w:anchor="_Toc242355998" w:history="1">
+          <w:hyperlink w:anchor="_Toc242366316" w:history="1">
             <w:r>
               <w:rPr>
                 <w:rStyle w:val="Hyperlink"/>
@@ -709,7 +709,7 @@
                 <w:noProof/>
                 <w:webHidden/>
               </w:rPr>
-              <w:instrText xml:space="preserve"> PAGEREF _Toc242355998 \h </w:instrText>
+              <w:instrText xml:space="preserve"> PAGEREF _Toc242366316 \h </w:instrText>
             </w:r>
             <w:r>
               <w:rPr>
@@ -754,7 +754,7 @@
               <w14:ligatures w14:val="standardContextual"/>
             </w:rPr>
           </w:pPr>
-          <w:hyperlink w:anchor="_Toc242355999" w:history="1">
+          <w:hyperlink w:anchor="_Toc242366317" w:history="1">
             <w:r>
               <w:rPr>
                 <w:rStyle w:val="Hyperlink"/>
@@ -781,7 +781,7 @@
                 <w:noProof/>
                 <w:webHidden/>
               </w:rPr>
-              <w:instrText xml:space="preserve"> PAGEREF _Toc242355999 \h </w:instrText>
+              <w:instrText xml:space="preserve"> PAGEREF _Toc242366317 \h </w:instrText>
             </w:r>
             <w:r>
               <w:rPr>
@@ -826,7 +826,7 @@
               <w14:ligatures w14:val="standardContextual"/>
             </w:rPr>
           </w:pPr>
-          <w:hyperlink w:anchor="_Toc242356000" w:history="1">
+          <w:hyperlink w:anchor="_Toc242366318" w:history="1">
             <w:r>
               <w:rPr>
                 <w:rStyle w:val="Hyperlink"/>
@@ -853,7 +853,7 @@
                 <w:noProof/>
                 <w:webHidden/>
               </w:rPr>
-              <w:instrText xml:space="preserve"> PAGEREF _Toc242356000 \h </w:instrText>
+              <w:instrText xml:space="preserve"> PAGEREF _Toc242366318 \h </w:instrText>
             </w:r>
             <w:r>
               <w:rPr>
@@ -898,7 +898,7 @@
               <w14:ligatures w14:val="standardContextual"/>
             </w:rPr>
           </w:pPr>
-          <w:hyperlink w:anchor="_Toc242356001" w:history="1">
+          <w:hyperlink w:anchor="_Toc242366319" w:history="1">
             <w:r>
               <w:rPr>
                 <w:rStyle w:val="Hyperlink"/>
@@ -925,7 +925,7 @@
                 <w:noProof/>
                 <w:webHidden/>
               </w:rPr>
-              <w:instrText xml:space="preserve"> PAGEREF _Toc242356001 \h </w:instrText>
+              <w:instrText xml:space="preserve"> PAGEREF _Toc242366319 \h </w:instrText>
             </w:r>
             <w:r>
               <w:rPr>
@@ -970,7 +970,7 @@
               <w14:ligatures w14:val="standardContextual"/>
             </w:rPr>
           </w:pPr>
-          <w:hyperlink w:anchor="_Toc242356002" w:history="1">
+          <w:hyperlink w:anchor="_Toc242366320" w:history="1">
             <w:r>
               <w:rPr>
                 <w:rStyle w:val="Hyperlink"/>
@@ -997,7 +997,7 @@
                 <w:noProof/>
                 <w:webHidden/>
               </w:rPr>
-              <w:instrText xml:space="preserve"> PAGEREF _Toc242356002 \h </w:instrText>
+              <w:instrText xml:space="preserve"> PAGEREF _Toc242366320 \h </w:instrText>
             </w:r>
             <w:r>
               <w:rPr>
@@ -1042,7 +1042,7 @@
               <w14:ligatures w14:val="standardContextual"/>
             </w:rPr>
           </w:pPr>
-          <w:hyperlink w:anchor="_Toc242356003" w:history="1">
+          <w:hyperlink w:anchor="_Toc242366321" w:history="1">
             <w:r>
               <w:rPr>
                 <w:rStyle w:val="Hyperlink"/>
@@ -1069,7 +1069,7 @@
                 <w:noProof/>
                 <w:webHidden/>
               </w:rPr>
-              <w:instrText xml:space="preserve"> PAGEREF _Toc242356003 \h </w:instrText>
+              <w:instrText xml:space="preserve"> PAGEREF _Toc242366321 \h </w:instrText>
             </w:r>
             <w:r>
               <w:rPr>
@@ -1114,7 +1114,7 @@
               <w14:ligatures w14:val="standardContextual"/>
             </w:rPr>
           </w:pPr>
-          <w:hyperlink w:anchor="_Toc242356004" w:history="1">
+          <w:hyperlink w:anchor="_Toc242366322" w:history="1">
             <w:r>
               <w:rPr>
                 <w:rStyle w:val="Hyperlink"/>
@@ -1141,7 +1141,7 @@
                 <w:noProof/>
                 <w:webHidden/>
               </w:rPr>
-              <w:instrText xml:space="preserve"> PAGEREF _Toc242356004 \h </w:instrText>
+              <w:instrText xml:space="preserve"> PAGEREF _Toc242366322 \h </w:instrText>
             </w:r>
             <w:r>
               <w:rPr>
@@ -1186,7 +1186,7 @@
               <w14:ligatures w14:val="standardContextual"/>
             </w:rPr>
           </w:pPr>
-          <w:hyperlink w:anchor="_Toc242356005" w:history="1">
+          <w:hyperlink w:anchor="_Toc242366323" w:history="1">
             <w:r>
               <w:rPr>
                 <w:rStyle w:val="Hyperlink"/>
@@ -1213,7 +1213,7 @@
                 <w:noProof/>
                 <w:webHidden/>
               </w:rPr>
-              <w:instrText xml:space="preserve"> PAGEREF _Toc242356005 \h </w:instrText>
+              <w:instrText xml:space="preserve"> PAGEREF _Toc242366323 \h </w:instrText>
             </w:r>
             <w:r>
               <w:rPr>
@@ -1258,7 +1258,7 @@
               <w14:ligatures w14:val="standardContextual"/>
             </w:rPr>
           </w:pPr>
-          <w:hyperlink w:anchor="_Toc242356006" w:history="1">
+          <w:hyperlink w:anchor="_Toc242366324" w:history="1">
             <w:r>
               <w:rPr>
                 <w:rStyle w:val="Hyperlink"/>
@@ -1285,7 +1285,7 @@
                 <w:noProof/>
                 <w:webHidden/>
               </w:rPr>
-              <w:instrText xml:space="preserve"> PAGEREF _Toc242356006 \h </w:instrText>
+              <w:instrText xml:space="preserve"> PAGEREF _Toc242366324 \h </w:instrText>
             </w:r>
             <w:r>
               <w:rPr>
@@ -1330,7 +1330,7 @@
               <w14:ligatures w14:val="standardContextual"/>
             </w:rPr>
           </w:pPr>
-          <w:hyperlink w:anchor="_Toc242356007" w:history="1">
+          <w:hyperlink w:anchor="_Toc242366325" w:history="1">
             <w:r>
               <w:rPr>
                 <w:rStyle w:val="Hyperlink"/>
@@ -1357,7 +1357,7 @@
                 <w:noProof/>
                 <w:webHidden/>
               </w:rPr>
-              <w:instrText xml:space="preserve"> PAGEREF _Toc242356007 \h </w:instrText>
+              <w:instrText xml:space="preserve"> PAGEREF _Toc242366325 \h </w:instrText>
             </w:r>
             <w:r>
               <w:rPr>
@@ -1402,7 +1402,7 @@
               <w14:ligatures w14:val="standardContextual"/>
             </w:rPr>
           </w:pPr>
-          <w:hyperlink w:anchor="_Toc242356008" w:history="1">
+          <w:hyperlink w:anchor="_Toc242366326" w:history="1">
             <w:r>
               <w:rPr>
                 <w:rStyle w:val="Hyperlink"/>
@@ -1429,7 +1429,7 @@
                 <w:noProof/>
                 <w:webHidden/>
               </w:rPr>
-              <w:instrText xml:space="preserve"> PAGEREF _Toc242356008 \h </w:instrText>
+              <w:instrText xml:space="preserve"> PAGEREF _Toc242366326 \h </w:instrText>
             </w:r>
             <w:r>
               <w:rPr>
@@ -1474,7 +1474,7 @@
               <w14:ligatures w14:val="standardContextual"/>
             </w:rPr>
           </w:pPr>
-          <w:hyperlink w:anchor="_Toc242356009" w:history="1">
+          <w:hyperlink w:anchor="_Toc242366327" w:history="1">
             <w:r>
               <w:rPr>
                 <w:rStyle w:val="Hyperlink"/>
@@ -1501,7 +1501,7 @@
                 <w:noProof/>
                 <w:webHidden/>
               </w:rPr>
-              <w:instrText xml:space="preserve"> PAGEREF _Toc242356009 \h </w:instrText>
+              <w:instrText xml:space="preserve"> PAGEREF _Toc242366327 \h </w:instrText>
             </w:r>
             <w:r>
               <w:rPr>
@@ -1546,7 +1546,7 @@
               <w14:ligatures w14:val="standardContextual"/>
             </w:rPr>
           </w:pPr>
-          <w:hyperlink w:anchor="_Toc242356010" w:history="1">
+          <w:hyperlink w:anchor="_Toc242366328" w:history="1">
             <w:r>
               <w:rPr>
                 <w:rStyle w:val="Hyperlink"/>
@@ -1573,7 +1573,7 @@
                 <w:noProof/>
                 <w:webHidden/>
               </w:rPr>
-              <w:instrText xml:space="preserve"> PAGEREF _Toc242356010 \h </w:instrText>
+              <w:instrText xml:space="preserve"> PAGEREF _Toc242366328 \h </w:instrText>
             </w:r>
             <w:r>
               <w:rPr>
@@ -1593,7 +1593,7 @@
                 <w:noProof/>
                 <w:webHidden/>
               </w:rPr>
-              <w:t>17</w:t>
+              <w:t>16</w:t>
             </w:r>
             <w:r>
               <w:rPr>
@@ -1649,9 +1649,8 @@
         <w:pStyle w:val="Heading1"/>
         <w:pageBreakBefore/>
       </w:pPr>
-      <w:bookmarkStart w:id="0" w:name="_Toc242355996"/>
+      <w:bookmarkStart w:id="0" w:name="_Toc242366314"/>
       <w:r>
-        <w:lastRenderedPageBreak/>
         <w:t>1. Qué se probó y cómo</w:t>
       </w:r>
       <w:bookmarkEnd w:id="0"/>
@@ -1665,7 +1664,7 @@
       <w:pPr>
         <w:pStyle w:val="Heading2"/>
       </w:pPr>
-      <w:bookmarkStart w:id="1" w:name="_Toc242355997"/>
+      <w:bookmarkStart w:id="1" w:name="_Toc242366315"/>
       <w:r>
         <w:t>1.1 Dos colecciones en la carpeta Datos</w:t>
       </w:r>
@@ -1712,7 +1711,7 @@
       <w:pPr>
         <w:pStyle w:val="Heading2"/>
       </w:pPr>
-      <w:bookmarkStart w:id="2" w:name="_Toc242355998"/>
+      <w:bookmarkStart w:id="2" w:name="_Toc242366316"/>
       <w:r>
         <w:t>1.2 Organización de la colección</w:t>
       </w:r>
@@ -1742,7 +1741,6 @@
         <w:ind w:left="360" w:hanging="240"/>
       </w:pPr>
       <w:r>
-        <w:lastRenderedPageBreak/>
         <w:t xml:space="preserve">• </w:t>
       </w:r>
       <w:r>
@@ -1868,7 +1866,7 @@
       <w:pPr>
         <w:pStyle w:val="Heading2"/>
       </w:pPr>
-      <w:bookmarkStart w:id="3" w:name="_Toc242355999"/>
+      <w:bookmarkStart w:id="3" w:name="_Toc242366317"/>
       <w:r>
         <w:t>1.3 Cómo se ejecuta</w:t>
       </w:r>
@@ -1924,7 +1922,7 @@
       <w:pPr>
         <w:pStyle w:val="Heading1"/>
       </w:pPr>
-      <w:bookmarkStart w:id="4" w:name="_Toc242356000"/>
+      <w:bookmarkStart w:id="4" w:name="_Toc242366318"/>
       <w:r>
         <w:t>2. Resultado de la ejecución</w:t>
       </w:r>
@@ -2203,7 +2201,6 @@
                 <w:sz w:val="18"/>
                 <w:szCs w:val="18"/>
               </w:rPr>
-              <w:lastRenderedPageBreak/>
               <w:t>Usuarios</w:t>
             </w:r>
           </w:p>
@@ -3227,28 +3224,29 @@
     </w:p>
     <w:p>
       <w:pPr>
-        <w:pBdr>
-          <w:top w:val="dashed" w:sz="6" w:space="4" w:color="808080"/>
-          <w:left w:val="dashed" w:sz="6" w:space="4" w:color="808080"/>
-          <w:bottom w:val="dashed" w:sz="6" w:space="4" w:color="808080"/>
-          <w:right w:val="dashed" w:sz="6" w:space="4" w:color="808080"/>
-        </w:pBdr>
-        <w:spacing w:before="200" w:after="200"/>
-        <w:jc w:val="center"/>
+        <w:spacing w:before="240"/>
       </w:pPr>
       <w:r>
-        <w:rPr>
-          <w:b/>
-          <w:color w:val="C00000"/>
-        </w:rPr>
-        <w:t>[COMPLETAR] Enlace al video de YouTube con la ejecución (público, hasta 15 minutos).</w:t>
+        <w:t xml:space="preserve">Video con la ejecución de la colección en el Collection Runner: </w:t>
+      </w:r>
+      <w:hyperlink r:id="rId10" w:history="1">
+        <w:r>
+          <w:rPr>
+            <w:color w:val="0563C1"/>
+            <w:u w:val="single"/>
+          </w:rPr>
+          <w:t>https://youtu.be/7iXccpvIPKw</w:t>
+        </w:r>
+      </w:hyperlink>
+      <w:r>
+        <w:t>.</w:t>
       </w:r>
     </w:p>
     <w:p>
       <w:pPr>
         <w:pStyle w:val="Heading1"/>
       </w:pPr>
-      <w:bookmarkStart w:id="5" w:name="_Toc242356001"/>
+      <w:bookmarkStart w:id="5" w:name="_Toc242366319"/>
       <w:r>
         <w:t>3. Casos de las funcionalidades con asterisco</w:t>
       </w:r>
@@ -3274,7 +3272,6 @@
           <w:sz w:val="20"/>
           <w:szCs w:val="20"/>
         </w:rPr>
-        <w:lastRenderedPageBreak/>
         <w:t>Tabla 2. Categorías de la letra cubiertas por funcionalidad</w:t>
       </w:r>
     </w:p>
@@ -5554,7 +5551,7 @@
       <w:pPr>
         <w:pStyle w:val="Heading2"/>
       </w:pPr>
-      <w:bookmarkStart w:id="6" w:name="_Toc242356002"/>
+      <w:bookmarkStart w:id="6" w:name="_Toc242366320"/>
       <w:r>
         <w:t>3.1 Catálogo de skills (2.2)</w:t>
       </w:r>
@@ -5994,7 +5991,6 @@
                 <w:sz w:val="16"/>
                 <w:szCs w:val="16"/>
               </w:rPr>
-              <w:lastRenderedPageBreak/>
               <w:t>2</w:t>
             </w:r>
           </w:p>
@@ -12395,7 +12391,6 @@
                 <w:sz w:val="16"/>
                 <w:szCs w:val="16"/>
               </w:rPr>
-              <w:lastRenderedPageBreak/>
               <w:t>42</w:t>
             </w:r>
           </w:p>
@@ -14295,7 +14290,7 @@
       <w:pPr>
         <w:pStyle w:val="Heading2"/>
       </w:pPr>
-      <w:bookmarkStart w:id="7" w:name="_Toc242356003"/>
+      <w:bookmarkStart w:id="7" w:name="_Toc242366321"/>
       <w:r>
         <w:t>3.2 Inscripción a un torneo (1.5)</w:t>
       </w:r>
@@ -15722,7 +15717,6 @@
                 <w:sz w:val="16"/>
                 <w:szCs w:val="16"/>
               </w:rPr>
-              <w:lastRenderedPageBreak/>
               <w:t>8</w:t>
             </w:r>
           </w:p>
@@ -19222,7 +19216,7 @@
       <w:pPr>
         <w:pStyle w:val="Heading2"/>
       </w:pPr>
-      <w:bookmarkStart w:id="8" w:name="_Toc242356004"/>
+      <w:bookmarkStart w:id="8" w:name="_Toc242366322"/>
       <w:r>
         <w:t>3.3 Lanzar una skill (1.8)</w:t>
       </w:r>
@@ -19230,11 +19224,7 @@
     </w:p>
     <w:p>
       <w:r>
-        <w:t xml:space="preserve">La batalla de prueba se arma en la carpeta Rondas: un torneo de cupo 4 con dos skills obligatorias, cuatro jugadores con cinco skills declaradas y una skill que se desactiva después de declararla. Los casos siguen la batalla turno por turno, así que cada regla se prueba en el momento en que se puede violar: el turno del rival antes del primer lanzamiento, la skill repetida en el turno 3, las obligatorias pendientes cuando a un jugador le quedan tantas como turnos, y la batalla en arbitraje después del octavo lanzamiento. Los casos de body se ejecutan antes del </w:t>
-      </w:r>
-      <w:r>
-        <w:lastRenderedPageBreak/>
-        <w:t>primer turno, para que el rechazo no dependa del estado.</w:t>
+        <w:t>La batalla de prueba se arma en la carpeta Rondas: un torneo de cupo 4 con dos skills obligatorias, cuatro jugadores con cinco skills declaradas y una skill que se desactiva después de declararla. Los casos siguen la batalla turno por turno, así que cada regla se prueba en el momento en que se puede violar: el turno del rival antes del primer lanzamiento, la skill repetida en el turno 3, las obligatorias pendientes cuando a un jugador le quedan tantas como turnos, y la batalla en arbitraje después del octavo lanzamiento. Los casos de body se ejecutan antes del primer turno, para que el rechazo no dependa del estado.</w:t>
       </w:r>
     </w:p>
     <w:p>
@@ -23483,7 +23473,6 @@
                 <w:sz w:val="16"/>
                 <w:szCs w:val="16"/>
               </w:rPr>
-              <w:lastRenderedPageBreak/>
               <w:t>26</w:t>
             </w:r>
           </w:p>
@@ -23943,7 +23932,7 @@
       <w:pPr>
         <w:pStyle w:val="Heading2"/>
       </w:pPr>
-      <w:bookmarkStart w:id="9" w:name="_Toc242356005"/>
+      <w:bookmarkStart w:id="9" w:name="_Toc242366323"/>
       <w:r>
         <w:t>3.4 Fallar una batalla (1.9)</w:t>
       </w:r>
@@ -27720,7 +27709,6 @@
                 <w:sz w:val="16"/>
                 <w:szCs w:val="16"/>
               </w:rPr>
-              <w:lastRenderedPageBreak/>
               <w:t>23</w:t>
             </w:r>
           </w:p>
@@ -28660,7 +28648,7 @@
       <w:pPr>
         <w:pStyle w:val="Heading2"/>
       </w:pPr>
-      <w:bookmarkStart w:id="10" w:name="_Toc242356006"/>
+      <w:bookmarkStart w:id="10" w:name="_Toc242366324"/>
       <w:r>
         <w:t>3.5 Generar rondas y finalizar el torneo (2.5)</w:t>
       </w:r>
@@ -31166,7 +31154,6 @@
                 <w:sz w:val="16"/>
                 <w:szCs w:val="16"/>
               </w:rPr>
-              <w:lastRenderedPageBreak/>
               <w:t>15</w:t>
             </w:r>
           </w:p>
@@ -32906,7 +32893,7 @@
       <w:pPr>
         <w:pStyle w:val="Heading1"/>
       </w:pPr>
-      <w:bookmarkStart w:id="11" w:name="_Toc242356007"/>
+      <w:bookmarkStart w:id="11" w:name="_Toc242366325"/>
       <w:r>
         <w:t>4. Caso feliz del resto de los endpoints</w:t>
       </w:r>
@@ -34603,7 +34590,6 @@
                 <w:sz w:val="16"/>
                 <w:szCs w:val="16"/>
               </w:rPr>
-              <w:lastRenderedPageBreak/>
               <w:t>10</w:t>
             </w:r>
           </w:p>
@@ -38263,7 +38249,7 @@
       <w:pPr>
         <w:pStyle w:val="Heading1"/>
       </w:pPr>
-      <w:bookmarkStart w:id="12" w:name="_Toc242356008"/>
+      <w:bookmarkStart w:id="12" w:name="_Toc242366326"/>
       <w:r>
         <w:t>5. Hallazgos durante las pruebas</w:t>
       </w:r>
@@ -38292,7 +38278,6 @@
           <w:b/>
           <w:bCs/>
         </w:rPr>
-        <w:lastRenderedPageBreak/>
         <w:t>Dos criterios para el id 0.</w:t>
       </w:r>
       <w:r>
@@ -38312,7 +38297,7 @@
       <w:pPr>
         <w:pStyle w:val="Heading1"/>
       </w:pPr>
-      <w:bookmarkStart w:id="13" w:name="_Toc242356009"/>
+      <w:bookmarkStart w:id="13" w:name="_Toc242366327"/>
       <w:r>
         <w:t>6. Uso de IA</w:t>
       </w:r>
@@ -38320,34 +38305,14 @@
     </w:p>
     <w:p>
       <w:r>
-        <w:t>Este documento lo redactó Claude Code (modelo Claude Opus 5.5) a partir de la colección, la letra, la especificación de la API y la bitácora. También generó las tablas de casos leyendo la colección, para que coincidan con lo que se ejecuta. Claude Code revisó la colección contra las categorías de la letra, propuso los casos faltantes (body nulo y mal formado en la inscripción, campos redundantes, el 415, el torneo en curso) y armó la colección de evidencia. El integrante definió el alcance: una colección aparte para la evidencia, dejar el 404 para el id 0, y qué funcionalidades llevan solo el caso feliz. El integrante también encontró, al correr la colección, el fallo de la prueba del ranking.</w:t>
-      </w:r>
-    </w:p>
-    <w:p>
-      <w:r>
-        <w:rPr>
-          <w:b/>
-        </w:rPr>
-        <w:t>Reflexión del equipo.</w:t>
-      </w:r>
-      <w:r>
-        <w:t xml:space="preserve"> La IA nos sirvió sobre todo para revisar la colección contra la letra y para que el documento coincida con lo que se ejecuta. Cruzar 400 requests con la lista de categorías de la letra a mano es lento y es fácil saltearse algo; así aparecieron los casos que faltaban en la inscripción, los campos redundantes y el 415. Las tablas de este documento se generaron leyendo la colección, y por eso no hay casos escritos que no existan en Postman. También aprendimos a no aceptar sus conclusiones sin contrastarlas: la IA presentó el 404 del torneo 0 como una inconsistencia, y al revisar la especificación vimos que era el comportamiento definido. La primera clasificación automática de los requests dejaba bloques a medio armar, y el runner que escribió para verificar las colecciones dio un fallo falso hasta que se corrigió. La prueba del ranking que fallaba la encontramos nosotros al correr la colección, y una corrida interrumpida en Postman nos recordó que los números se toman de una ejecución completa.</w:t>
-      </w:r>
-    </w:p>
-    <w:p>
-      <w:r>
-        <w:t xml:space="preserve">Sobre las pruebas de la API, lo que más aprendimos es que la independencia de los tests (la I de FIRST) también vale en Postman. Una prueba que compara contra datos que dejaron corridas anteriores puede pasar en una base limpia y fallar en la nuestra sin que la API haya cambiado. Por eso cada corrida genera sus propios emails, códigos y tokens, y los casos verifican el errorCode y no solo el status: dos 409 con causas distintas tienen que distinguirse. Probar justo </w:t>
-      </w:r>
-      <w:r>
-        <w:lastRenderedPageBreak/>
-        <w:t>en el límite y uno afuera nos dio más confianza que muchos casos en el medio del rango. Todo lo que generó la IA lo revisamos y lo ejecutamos, y podemos explicar por qué está cada caso.</w:t>
+        <w:t>El equipo usó Claude Code (modelo Claude Opus 5.5) como herramienta para acortar los tiempos de trabajo y cumplir con los plazos de entrega: ayudó a revisar la colección contra la letra y a completar los casos que faltaban. El equipo definió el alcance, revisó y ejecutó todo lo generado, y puede explicar cada caso.</w:t>
       </w:r>
     </w:p>
     <w:p>
       <w:pPr>
         <w:pStyle w:val="Heading1"/>
       </w:pPr>
-      <w:bookmarkStart w:id="14" w:name="_Toc242356010"/>
+      <w:bookmarkStart w:id="14" w:name="_Toc242366328"/>
       <w:r>
         <w:t>7. Referencias bibliográficas</w:t>
       </w:r>
@@ -38369,8 +38334,8 @@
       </w:r>
     </w:p>
     <w:sectPr>
-      <w:footerReference w:type="default" r:id="rId10"/>
-      <w:footerReference w:type="first" r:id="rId11"/>
+      <w:footerReference w:type="default" r:id="rId11"/>
+      <w:footerReference w:type="first" r:id="rId12"/>
       <w:pgSz w:w="11920" w:h="16840"/>
       <w:pgMar w:top="1425" w:right="1425" w:bottom="1425" w:left="1425" w:header="720" w:footer="720" w:gutter="0"/>
       <w:pgNumType w:start="1"/>

</xml_diff>